<commit_message>
Switch to PDF-only personal travel claims and clean statement output
</commit_message>
<xml_diff>
--- a/downloads/contest-proposal.docx
+++ b/downloads/contest-proposal.docx
@@ -22,7 +22,7 @@
           <w:rFonts w:ascii="맑은 고딕" w:hAnsi="맑은 고딕" w:eastAsia="맑은 고딕" w:cs="맑은 고딕"/>
           <w:b/>
         </w:rPr>
-        <w:t>제안명: 출장 화면 한 장으로 만드는 로컬 AI 여비명세서</w:t>
+        <w:t>제안명: AI 개발 보조로 구현하는 PDF 기반 여비명세서 자동화</w:t>
       </w:r>
     </w:p>
     <w:p>
@@ -56,7 +56,7 @@
           <w:rFonts w:ascii="맑은 고딕" w:hAnsi="맑은 고딕" w:eastAsia="맑은 고딕" w:cs="맑은 고딕"/>
           <w:b w:val="0"/>
         </w:rPr>
-        <w:t>출장처리 시스템에 이미 입력된 내역을 여비지급명세서로 작성할 때, 담당자는 날짜·시간·출장지·목적을 다시 옮기고 차량 사용 여부에 따른 일비와 합계를 계산해야 한다. 같은 정보를 다른 서식으로 옮기는 과정에서 반복 입력과 대조 작업이 발생한다.</w:t>
+        <w:t>출장처리 시스템에 이미 입력된 내역을 여비지급명세서로 작성할 때, 담당자는 날짜·시간·출장지·목적을 다시 옮기고 차량 사용 여부에 따른 일비와 합계를 계산한다. 같은 정보를 다른 서식으로 옮기는 과정에서 반복 입력과 대조 작업이 발생한다.</w:t>
       </w:r>
     </w:p>
     <w:p>
@@ -65,7 +65,7 @@
           <w:rFonts w:ascii="맑은 고딕" w:hAnsi="맑은 고딕" w:eastAsia="맑은 고딕" w:cs="맑은 고딕"/>
           <w:b w:val="0"/>
         </w:rPr>
-        <w:t>특히 신청한 출장시간과 실제 출발·복귀 시각이 함께 표시되어 잘못된 시간을 옮길 수 있고, 미신청·취소·반려 내역이 섞이면 지급대상을 따로 확인해야 한다. 화면 캡처만으로 기존 업무 서식을 만들되, 담당자의 원본 대조와 지급기준 확인을 작업 과정에 포함하는 도구를 제안한다.</w:t>
+        <w:t>개인별 출장내역 PDF에는 신청행과 확인행이 함께 표시되어 예정시간과 실제시간을 혼동하기 쉽다. 한 출장의 두 행이 페이지 사이에서 나뉘기도 하며, 미전송 등 청구에 포함하지 않을 내역도 구분해야 한다. 기존 시스템에서 내려받은 PDF를 바로 업무 양식으로 바꾸는 도구를 제안한다.</w:t>
       </w:r>
     </w:p>
     <w:p>
@@ -90,14 +90,7 @@
           <w:rFonts w:ascii="맑은 고딕" w:hAnsi="맑은 고딕" w:eastAsia="맑은 고딕" w:cs="맑은 고딕"/>
           <w:b/>
         </w:rPr>
-        <w:t>근무지내출장처리 목록의 캡처 → AI 문자 인식 → 담당자 확인 → 여비명세서 PDF 생성</w:t>
-      </w:r>
-      <w:r>
-        <w:rPr>
-          <w:rFonts w:ascii="맑은 고딕" w:hAnsi="맑은 고딕" w:eastAsia="맑은 고딕" w:cs="맑은 고딕"/>
-          <w:b w:val="0"/>
-        </w:rPr>
-        <w:t xml:space="preserve"> 과정을 하나의 PC용 프로그램으로 연결한다.</w:t>
+        <w:t>AI 개발 도우미로 업무 규칙과 변환 도구를 구현하고, 직원은 PDF 선택 → 내역 확인·필요 수정 → 명세서 저장으로 사용한다.</w:t>
       </w:r>
     </w:p>
     <w:p>
@@ -106,7 +99,7 @@
           <w:rFonts w:ascii="맑은 고딕" w:hAnsi="맑은 고딕" w:eastAsia="맑은 고딕" w:cs="맑은 고딕"/>
           <w:b w:val="0"/>
         </w:rPr>
-        <w:t>신경망 기반의 Tesseract LSTM OCR이 캡처의 한글·숫자를 인식한다. 인식한 글자를 표의 열과 행에 대응시켜 부서·직급·성명·출장일시·출장지·목적·공용차량·결재상태를 정리하고, 담당자가 원본과 비교해 수정할 수 있도록 보여 준다.</w:t>
+        <w:t>AI 개발 보조를 활용하여 PDF 표 구조 분석, 실제·신청시간 구분 규칙, 계산 코드, 서식 생성과 검증 사례를 구현한다. 현재 프로그램의 실행 단계는 PDF 안의 문자·표를 직접 추출하고 정해진 계산 규칙을 적용하는 방식이다. 이미지 문자 인식이나 생성형 AI가 출장 내역을 판단하는 기능으로 설명하지 않는다.</w:t>
       </w:r>
     </w:p>
     <w:p>
@@ -135,14 +128,14 @@
           <w:rFonts w:ascii="맑은 고딕" w:hAnsi="맑은 고딕" w:eastAsia="맑은 고딕" w:cs="맑은 고딕"/>
           <w:b/>
         </w:rPr>
-        <w:t>실제 시각 구분:</w:t>
+        <w:t>실제 시간 우선:</w:t>
       </w:r>
       <w:r>
         <w:rPr>
           <w:rFonts w:ascii="맑은 고딕" w:hAnsi="맑은 고딕" w:eastAsia="맑은 고딕" w:cs="맑은 고딕"/>
           <w:b w:val="0"/>
         </w:rPr>
-        <w:t xml:space="preserve"> 일비 제안 계산은 실제 출발·복귀 시각을 사용하고, 누락된 값을 신청시간으로 대신 채우지 않는다.</w:t>
+        <w:t xml:space="preserve"> 신청·확인행을 출장별로 묶고 확인행의 실제 일시를 사용한다. 실제 시간이 없으면 신청시간으로 대신 채우지 않는다.</w:t>
       </w:r>
     </w:p>
     <w:p>
@@ -162,14 +155,14 @@
           <w:rFonts w:ascii="맑은 고딕" w:hAnsi="맑은 고딕" w:eastAsia="맑은 고딕" w:cs="맑은 고딕"/>
           <w:b/>
         </w:rPr>
-        <w:t>지급대상 확인:</w:t>
+        <w:t>상태·대상 구분:</w:t>
       </w:r>
       <w:r>
         <w:rPr>
           <w:rFonts w:ascii="맑은 고딕" w:hAnsi="맑은 고딕" w:eastAsia="맑은 고딕" w:cs="맑은 고딕"/>
           <w:b w:val="0"/>
         </w:rPr>
-        <w:t xml:space="preserve"> 미신청·취소·반려 등으로 인식된 행은 기본 제외하고, 담당자가 포함 대상을 확인한다.</w:t>
+        <w:t xml:space="preserve"> 개인별 PDF의 확인행에 표시된 상태를 우선하며 미전송 등은 기본 제외한다. 관외·여러 날 출장은 관내 예시 기준의 자동 계산 대상에서 제외한다.</w:t>
       </w:r>
     </w:p>
     <w:p>
@@ -189,14 +182,14 @@
           <w:rFonts w:ascii="맑은 고딕" w:hAnsi="맑은 고딕" w:eastAsia="맑은 고딕" w:cs="맑은 고딕"/>
           <w:b/>
         </w:rPr>
-        <w:t>확인 후 서식화:</w:t>
+        <w:t>간단한 서식화:</w:t>
       </w:r>
       <w:r>
         <w:rPr>
           <w:rFonts w:ascii="맑은 고딕" w:hAnsi="맑은 고딕" w:eastAsia="맑은 고딕" w:cs="맑은 고딕"/>
           <w:b w:val="0"/>
         </w:rPr>
-        <w:t xml:space="preserve"> 기관 지급기준과 인식 결과 확인이 끝나지 않으면 검토용 PDF로 표시한다. 서명·날인은 자동 생성하지 않는다.</w:t>
+        <w:t xml:space="preserve"> PDF를 넣으면 내역과 금액이 자동으로 준비된다. 수정은 화면에서 하고, 출력에는 검토 상태 워터마크를 넣지 않는다. 서명·날인은 자동 생성하지 않는다.</w:t>
       </w:r>
     </w:p>
     <w:p>
@@ -216,14 +209,14 @@
           <w:rFonts w:ascii="맑은 고딕" w:hAnsi="맑은 고딕" w:eastAsia="맑은 고딕" w:cs="맑은 고딕"/>
           <w:b/>
         </w:rPr>
-        <w:t>로컬 처리:</w:t>
+        <w:t>PC 내부 처리:</w:t>
       </w:r>
       <w:r>
         <w:rPr>
           <w:rFonts w:ascii="맑은 고딕" w:hAnsi="맑은 고딕" w:eastAsia="맑은 고딕" w:cs="맑은 고딕"/>
           <w:b w:val="0"/>
         </w:rPr>
-        <w:t xml:space="preserve"> Windows 실행파일에 OCR 구성요소를 포함하여 외부 AI 서비스로 출장 자료를 전송하지 않는다.</w:t>
+        <w:t xml:space="preserve"> 원본 PDF와 출장 내역을 외부 서버로 보내지 않는다. AI 개발 보조의 역할과 실행 프로그램의 처리 방식을 구분한다.</w:t>
       </w:r>
     </w:p>
     <w:p>
@@ -232,44 +225,7 @@
           <w:rFonts w:ascii="맑은 고딕" w:hAnsi="맑은 고딕" w:eastAsia="맑은 고딕" w:cs="맑은 고딕"/>
           <w:b w:val="0"/>
         </w:rPr>
-        <w:t xml:space="preserve">현재 초기 구현은 PNG·JPG·WebP·BMP 캡처를 기본으로 읽고, 수정 화면과 관내 일비 제안 계산, A4 가로형 여비지급명세서 PDF 출력을 제공한다. 다운로드 권한이 있는 경우 월별집계 PDF를 보조 입력으로 활용할 수 있으며, PDF의 문자는 OCR 대신 직접 추출한다. PDF 권한이 없는 사용자의 캡처 입력도 유지한다. 기준시간·일비·공용차량 차감액·동일인 동일일 상한은 화면에서 확인·조정한다. 초기 제안값인 4시간 이상 2만원, 미만 1만원, 차량 사용 시 1만원 차감, 일일 상한 2만원은 </w:t>
-      </w:r>
-      <w:r>
-        <w:rPr>
-          <w:rFonts w:ascii="맑은 고딕" w:hAnsi="맑은 고딕" w:eastAsia="맑은 고딕" w:cs="맑은 고딕"/>
-          <w:b/>
-        </w:rPr>
-        <w:t>기관의 현행 기준 확인을 전제로</w:t>
-      </w:r>
-      <w:r>
-        <w:rPr>
-          <w:rFonts w:ascii="맑은 고딕" w:hAnsi="맑은 고딕" w:eastAsia="맑은 고딕" w:cs="맑은 고딕"/>
-          <w:b w:val="0"/>
-        </w:rPr>
-        <w:t xml:space="preserve"> 하며 관외·여러 날 출장은 별도 검토한다.</w:t>
-      </w:r>
-    </w:p>
-    <w:p>
-      <w:r>
-        <w:rPr>
-          <w:rFonts w:ascii="맑은 고딕" w:hAnsi="맑은 고딕" w:eastAsia="맑은 고딕" w:cs="맑은 고딕"/>
-          <w:b w:val="0"/>
-        </w:rPr>
-        <w:t xml:space="preserve">AI는 </w:t>
-      </w:r>
-      <w:r>
-        <w:rPr>
-          <w:rFonts w:ascii="맑은 고딕" w:hAnsi="맑은 고딕" w:eastAsia="맑은 고딕" w:cs="맑은 고딕"/>
-          <w:b/>
-        </w:rPr>
-        <w:t>이미지의 문자를 인식하는 단계</w:t>
-      </w:r>
-      <w:r>
-        <w:rPr>
-          <w:rFonts w:ascii="맑은 고딕" w:hAnsi="맑은 고딕" w:eastAsia="맑은 고딕" w:cs="맑은 고딕"/>
-          <w:b w:val="0"/>
-        </w:rPr>
-        <w:t>에 사용한다. 표 항목 정리, 여비 계산과 서식 생성은 정해진 규칙을 실행하는 코드이며, AI가 지급 적정성이나 결재를 판단하는 기능은 아니다.</w:t>
+        <w:t>초기 구현은 개인별 출장내역과 기존 월별집계 텍스트 PDF를 읽고, 편집 화면·관내 일비 계산·A4 가로형 여비지급명세서 출력을 제공한다. 기준시간·일비·차량 차감액·동일인 동일일 상한은 기관 기준에 맞게 조정할 수 있다. 초기값인 4시간 이상 2만원, 미만 1만원, 차량 사용 시 1만원 차감, 일일 상한 2만원은 예시이며 기관의 현행 기준을 확인하여 적용한다.</w:t>
       </w:r>
     </w:p>
     <w:p>
@@ -439,7 +395,7 @@
                 <w:b w:val="0"/>
                 <w:sz w:val="18"/>
               </w:rPr>
-              <w:t>출장 화면 확인 → 명세서에 재입력 → 실제시간·차량·지급대상 대조 → 계산·서식 정리</w:t>
+              <w:t>출장내역 확인 → 명세서에 재입력 → 실제시간·차량·대상 대조 → 계산·서식 정리</w:t>
             </w:r>
           </w:p>
         </w:tc>
@@ -464,7 +420,7 @@
                 <w:b w:val="0"/>
                 <w:sz w:val="18"/>
               </w:rPr>
-              <w:t>목록 캡처 → OCR 인식 → 원본 대조·수정 및 지급대상 선택 → 기준 확인·재계산 → PDF 저장</w:t>
+              <w:t>개인별 PDF 선택 → 자동 추출·계산 → 필요 항목 수정 → 명세서 PDF 저장</w:t>
             </w:r>
           </w:p>
         </w:tc>
@@ -544,7 +500,7 @@
                 <w:b w:val="0"/>
                 <w:sz w:val="18"/>
               </w:rPr>
-              <w:t>반복 입력을 줄이고 대조·확인에 집중하는 것이 목표. 절감 시간은 아직 실측하지 않음</w:t>
+              <w:t>전사·합계·서식 작업을 줄이는 것이 목표. 절감 시간은 아직 실측하지 않음</w:t>
             </w:r>
           </w:p>
         </w:tc>
@@ -599,7 +555,7 @@
                 <w:b w:val="0"/>
                 <w:sz w:val="18"/>
               </w:rPr>
-              <w:t>시각 혼동, 전사 누락, 합계 오류 등을 담당자가 확인</w:t>
+              <w:t>신청·실제시간 혼동, 누락, 합계 오류 등을 담당자가 확인</w:t>
             </w:r>
           </w:p>
         </w:tc>
@@ -624,7 +580,7 @@
                 <w:b w:val="0"/>
                 <w:sz w:val="18"/>
               </w:rPr>
-              <w:t>OCR 오인식 확인은 여전히 필요하나, 실제시간 구분·미확인 표시·고정규칙 계산으로 확인을 지원</w:t>
+              <w:t>확인행 우선 처리와 고정 계산 규칙으로 대조를 지원하며, 원본과 결과 확인은 담당자가 수행</w:t>
             </w:r>
           </w:p>
         </w:tc>
@@ -704,7 +660,7 @@
                 <w:b w:val="0"/>
                 <w:sz w:val="18"/>
               </w:rPr>
-              <w:t>인식·계산을 PC 내부에서 처리하고 원본과 출력 PDF는 담당자가 관리</w:t>
+              <w:t>원본 추출·계산·서식 생성을 PC 내부에서 처리하고 출력 PDF는 담당자가 관리</w:t>
             </w:r>
           </w:p>
         </w:tc>
@@ -730,7 +686,7 @@
           <w:rFonts w:ascii="맑은 고딕" w:hAnsi="맑은 고딕" w:eastAsia="맑은 고딕" w:cs="맑은 고딕"/>
           <w:b w:val="0"/>
         </w:rPr>
-        <w:t>을 대상으로 수기 작성과 도구 사용을 각각 수행하여 검증할 계획이다. OCR 처리뿐 아니라 수정·원본 대조까지 포함한 총시간, 일시·차량·금액의 원본 일치 여부, 수정 건수를 비교한다. 아직 측정하지 않은 절감률이나 정확도를 실적으로 제시하지 않는다.</w:t>
+        <w:t>으로 수기 작성과 도구 사용을 각각 수행하여 검증할 계획이다. PDF 불러오기부터 수정·원본 대조·저장까지의 총시간, 실제 일시·차량·금액의 원본 일치 여부, 수정 건수를 비교한다. 측정하지 않은 절감률이나 정확도를 실적으로 제시하지 않는다.</w:t>
       </w:r>
     </w:p>
     <w:p>
@@ -755,7 +711,7 @@
           <w:rFonts w:ascii="맑은 고딕" w:hAnsi="맑은 고딕" w:eastAsia="맑은 고딕" w:cs="맑은 고딕"/>
           <w:b w:val="0"/>
         </w:rPr>
-        <w:t>이미 입력한 출장 정보를 다시 옮기는 작업을 줄이고, 담당자가 실제시간·차량·지급대상과 금액 검토에 집중하도록 돕는다. 기관 양식을 자동으로 구성하여 문서 정리에 드는 수작업을 줄이는 효과를 기대한다.</w:t>
+        <w:t>이미 입력한 출장 정보를 다시 옮기는 작업을 줄이고, 담당자가 실제시간·차량·청구대상과 금액 확인에 집중하도록 돕는다. 정해진 기관 서식을 자동으로 구성하여 문서 정리에 드는 수작업도 줄이는 효과를 기대한다.</w:t>
       </w:r>
     </w:p>
     <w:p>
@@ -764,7 +720,7 @@
           <w:rFonts w:ascii="맑은 고딕" w:hAnsi="맑은 고딕" w:eastAsia="맑은 고딕" w:cs="맑은 고딕"/>
           <w:b w:val="0"/>
         </w:rPr>
-        <w:t>기존 OCR 기술을 실제·신청시간 구분, 결재상태 확인, 지급기준 확인과 연결한 점이 이 업무에 맞춘 적용이다. 같은 시스템과 양식을 사용하는 부서부터 가명 자료로 시험하고, 다른 양식은 표 구조·지급기준을 별도로 확인한 뒤 확대할 수 있다. 범용 사진 인식이나 여비 지급의 완전 자동화를 주장하지 않는다.</w:t>
+        <w:t>AI 개발 보조를 활용해 현업의 반복 작업을 작은 PC용 도구로 구체화한 사례로 확장할 수 있다. 같은 시스템·양식을 사용하는 부서부터 가명 자료로 시험하고, 다른 PDF 양식과 지급기준은 별도 검증 후 적용한다. 현재 구현은 문서 전사·계산·서식화를 돕는 도구이며 지급 적정성이나 결재를 대신 판단하지 않는다.</w:t>
       </w:r>
     </w:p>
     <w:p>
@@ -773,7 +729,7 @@
           <w:rFonts w:ascii="맑은 고딕" w:hAnsi="맑은 고딕" w:eastAsia="맑은 고딕" w:cs="맑은 고딕"/>
           <w:b w:val="0"/>
         </w:rPr>
-        <w:t>현재는 초기 구현 단계이며 실제 Windows PC에서의 전체 사용 흐름과 담당자 시범 사용을 추가 확인할 예정이다. 공식 업무 적용은 기관의 프로그램 사용 절차, 지급기준, 출력 양식 확인 후 추진한다.</w:t>
+        <w:t>실제 Windows PC의 사용 흐름과 담당자 시범 사용을 추가 확인하고, 기관의 프로그램 사용 절차·지급기준·출력 양식에 맞춰 업무에 적용한다.</w:t>
       </w:r>
     </w:p>
     <w:sectPr>

</xml_diff>